<commit_message>
chore: refresh resume variants with the VenueManager live-product line
</commit_message>
<xml_diff>
--- a/assets/Prashant_Anand_Resume_Dir.docx
+++ b/assets/Prashant_Anand_Resume_Dir.docx
@@ -275,6 +275,27 @@
       </w:r>
       <w:r>
         <w:t>Reference implementations are public: samisen-io/venue-assistant (MCP server in .NET 10 with xUnit tests) and samisen-io/eventonaut-api (LangChain + Pinecone RAG backend).</w:t>
+      </w:r>
+    </w:p>
+    <w:p>
+      <w:pPr>
+        <w:spacing w:after="40"/>
+        <w:ind w:left="317" w:hanging="230"/>
+      </w:pPr>
+      <w:r>
+        <w:t xml:space="preserve">•  </w:t>
+      </w:r>
+      <w:r>
+        <w:t xml:space="preserve">Designed, built and operate </w:t>
+      </w:r>
+      <w:r>
+        <w:rPr>
+          <w:b/>
+        </w:rPr>
+        <w:t>VenueManager</w:t>
+      </w:r>
+      <w:r>
+        <w:t xml:space="preserve"> (venuemanager.pro), a live multi-tenant SaaS for venue operators: Next.js/TypeScript on Vercel with Supabase row-level security for tenant isolation, Stripe subscription lifecycle, an Inngest-scheduled vendor-outreach agent on Claude, and 40+ Playwright end-to-end specs including tenant-boundary assertions.</w:t>
       </w:r>
     </w:p>
     <w:p>

</xml_diff>

<commit_message>
chore: revert the VenueManager line from both resume variants (portfolio only, per owner)
</commit_message>
<xml_diff>
--- a/assets/Prashant_Anand_Resume_Dir.docx
+++ b/assets/Prashant_Anand_Resume_Dir.docx
@@ -275,27 +275,6 @@
       </w:r>
       <w:r>
         <w:t>Reference implementations are public: samisen-io/venue-assistant (MCP server in .NET 10 with xUnit tests) and samisen-io/eventonaut-api (LangChain + Pinecone RAG backend).</w:t>
-      </w:r>
-    </w:p>
-    <w:p>
-      <w:pPr>
-        <w:spacing w:after="40"/>
-        <w:ind w:left="317" w:hanging="230"/>
-      </w:pPr>
-      <w:r>
-        <w:t xml:space="preserve">•  </w:t>
-      </w:r>
-      <w:r>
-        <w:t xml:space="preserve">Designed, built and operate </w:t>
-      </w:r>
-      <w:r>
-        <w:rPr>
-          <w:b/>
-        </w:rPr>
-        <w:t>VenueManager</w:t>
-      </w:r>
-      <w:r>
-        <w:t xml:space="preserve"> (venuemanager.pro), a live multi-tenant SaaS for venue operators: Next.js/TypeScript on Vercel with Supabase row-level security for tenant isolation, Stripe subscription lifecycle, an Inngest-scheduled vendor-outreach agent on Claude, and 40+ Playwright end-to-end specs including tenant-boundary assertions.</w:t>
       </w:r>
     </w:p>
     <w:p>

</xml_diff>

<commit_message>
assets: sync resumes (2026-09-23) [auto]
</commit_message>
<xml_diff>
--- a/assets/Prashant_Anand_Resume_Dir.docx
+++ b/assets/Prashant_Anand_Resume_Dir.docx
@@ -17,7 +17,7 @@
     </w:p>
     <w:p>
       <w:r>
-        <w:t>Hyderabad, India | +91 87901 89246 | prashantanand@outlook.com | linkedin.com/in/prashantanand | github.com/prashant-anand</w:t>
+        <w:t>Hyderabad, India | +91 90145 85588 | prashantanand@outlook.com | linkedin.com/in/prashantanand | github.com/prashant-anand</w:t>
       </w:r>
     </w:p>
     <w:p>
@@ -426,7 +426,7 @@
         <w:t xml:space="preserve">•  </w:t>
       </w:r>
       <w:r>
-        <w:t>MBA, Executive Business Administration - Washington University in St. Louis, Olin Business School, USA</w:t>
+        <w:t>MBA, Marketing - Washington University in St. Louis, Olin Business School, USA</w:t>
       </w:r>
     </w:p>
     <w:p>

</xml_diff>